<commit_message>
Added task 7 rule extraction to file 03
</commit_message>
<xml_diff>
--- a/Phase two contributions statement.docx
+++ b/Phase two contributions statement.docx
@@ -73,542 +73,30 @@
         </w:rPr>
       </w:pPr>
     </w:p>
-    <w:tbl>
-      <w:tblPr>
-        <w:tblStyle w:val="TableGrid"/>
-        <w:tblW w:w="0" w:type="auto"/>
-        <w:tblLook w:val="04A0" w:firstRow="1" w:lastRow="0" w:firstColumn="1" w:lastColumn="0" w:noHBand="0" w:noVBand="1"/>
-      </w:tblPr>
-      <w:tblGrid>
-        <w:gridCol w:w="3005"/>
-        <w:gridCol w:w="3005"/>
-        <w:gridCol w:w="3006"/>
-      </w:tblGrid>
-      <w:tr>
-        <w:tc>
-          <w:tcPr>
-            <w:tcW w:w="3005" w:type="dxa"/>
-            <w:vMerge w:val="restart"/>
-            <w:vAlign w:val="center"/>
-          </w:tcPr>
-          <w:p>
-            <w:pPr>
-              <w:jc w:val="center"/>
-              <w:rPr>
-                <w:rFonts w:ascii="Bahnschrift SemiLight" w:hAnsi="Bahnschrift SemiLight"/>
-                <w:sz w:val="28"/>
-                <w:szCs w:val="28"/>
-              </w:rPr>
-            </w:pPr>
-            <w:r>
-              <w:rPr>
-                <w:b/>
-                <w:bCs/>
-                <w:sz w:val="28"/>
-                <w:szCs w:val="28"/>
-              </w:rPr>
-              <w:t>Task</w:t>
-            </w:r>
-          </w:p>
-        </w:tc>
-        <w:tc>
-          <w:tcPr>
-            <w:tcW w:w="6011" w:type="dxa"/>
-            <w:gridSpan w:val="2"/>
-          </w:tcPr>
-          <w:p>
-            <w:pPr>
-              <w:jc w:val="center"/>
-              <w:rPr>
-                <w:b/>
-                <w:bCs/>
-                <w:sz w:val="28"/>
-                <w:szCs w:val="28"/>
-              </w:rPr>
-            </w:pPr>
-            <w:r>
-              <w:rPr>
-                <w:b/>
-                <w:bCs/>
-                <w:sz w:val="28"/>
-                <w:szCs w:val="28"/>
-              </w:rPr>
-              <w:t>Team Member’s Contributions</w:t>
-            </w:r>
-          </w:p>
-        </w:tc>
-      </w:tr>
-      <w:tr>
-        <w:tc>
-          <w:tcPr>
-            <w:tcW w:w="3005" w:type="dxa"/>
-            <w:vMerge/>
-          </w:tcPr>
-          <w:p>
-            <w:pPr>
-              <w:jc w:val="center"/>
-              <w:rPr>
-                <w:b/>
-                <w:bCs/>
-                <w:sz w:val="28"/>
-                <w:szCs w:val="28"/>
-              </w:rPr>
-            </w:pPr>
-          </w:p>
-        </w:tc>
-        <w:tc>
-          <w:tcPr>
-            <w:tcW w:w="3005" w:type="dxa"/>
-          </w:tcPr>
-          <w:p>
-            <w:pPr>
-              <w:jc w:val="center"/>
-              <w:rPr>
-                <w:rFonts w:ascii="Bahnschrift SemiLight" w:hAnsi="Bahnschrift SemiLight"/>
-                <w:i/>
-                <w:iCs/>
-                <w:sz w:val="28"/>
-                <w:szCs w:val="28"/>
-              </w:rPr>
-            </w:pPr>
-            <w:r>
-              <w:rPr>
-                <w:rFonts w:ascii="Bahnschrift SemiLight" w:hAnsi="Bahnschrift SemiLight"/>
-                <w:i/>
-                <w:iCs/>
-                <w:sz w:val="28"/>
-                <w:szCs w:val="28"/>
-              </w:rPr>
-              <w:t>Huyin</w:t>
-            </w:r>
-          </w:p>
-        </w:tc>
-        <w:tc>
-          <w:tcPr>
-            <w:tcW w:w="3006" w:type="dxa"/>
-          </w:tcPr>
-          <w:p>
-            <w:pPr>
-              <w:jc w:val="center"/>
-              <w:rPr>
-                <w:rFonts w:ascii="Bahnschrift SemiLight" w:hAnsi="Bahnschrift SemiLight"/>
-                <w:i/>
-                <w:iCs/>
-                <w:sz w:val="28"/>
-                <w:szCs w:val="28"/>
-              </w:rPr>
-            </w:pPr>
-            <w:r>
-              <w:rPr>
-                <w:rFonts w:ascii="Bahnschrift SemiLight" w:hAnsi="Bahnschrift SemiLight"/>
-                <w:i/>
-                <w:iCs/>
-                <w:sz w:val="28"/>
-                <w:szCs w:val="28"/>
-              </w:rPr>
-              <w:t>Erin</w:t>
-            </w:r>
-          </w:p>
-        </w:tc>
-      </w:tr>
-      <w:tr>
-        <w:tc>
-          <w:tcPr>
-            <w:tcW w:w="3005" w:type="dxa"/>
-          </w:tcPr>
-          <w:p>
-            <w:pPr>
-              <w:jc w:val="center"/>
-              <w:rPr>
-                <w:rFonts w:ascii="Bahnschrift SemiLight" w:hAnsi="Bahnschrift SemiLight"/>
-                <w:sz w:val="28"/>
-                <w:szCs w:val="28"/>
-              </w:rPr>
-            </w:pPr>
-            <w:r>
-              <w:rPr>
-                <w:rFonts w:ascii="Bahnschrift SemiLight" w:hAnsi="Bahnschrift SemiLight"/>
-                <w:sz w:val="28"/>
-                <w:szCs w:val="28"/>
-              </w:rPr>
-              <w:t>Number of commits to GitHub</w:t>
-            </w:r>
-          </w:p>
-        </w:tc>
-        <w:tc>
-          <w:tcPr>
-            <w:tcW w:w="3005" w:type="dxa"/>
-          </w:tcPr>
-          <w:p>
-            <w:pPr>
-              <w:jc w:val="center"/>
-              <w:rPr>
-                <w:rFonts w:ascii="Bahnschrift SemiLight" w:hAnsi="Bahnschrift SemiLight"/>
-                <w:sz w:val="28"/>
-                <w:szCs w:val="28"/>
-              </w:rPr>
-            </w:pPr>
-          </w:p>
-        </w:tc>
-        <w:tc>
-          <w:tcPr>
-            <w:tcW w:w="3006" w:type="dxa"/>
-          </w:tcPr>
-          <w:p>
-            <w:pPr>
-              <w:jc w:val="center"/>
-              <w:rPr>
-                <w:rFonts w:ascii="Bahnschrift SemiLight" w:hAnsi="Bahnschrift SemiLight"/>
-                <w:sz w:val="28"/>
-                <w:szCs w:val="28"/>
-              </w:rPr>
-            </w:pPr>
-          </w:p>
-        </w:tc>
-      </w:tr>
-      <w:tr>
-        <w:tc>
-          <w:tcPr>
-            <w:tcW w:w="3005" w:type="dxa"/>
-          </w:tcPr>
-          <w:p>
-            <w:pPr>
-              <w:jc w:val="center"/>
-              <w:rPr>
-                <w:rFonts w:ascii="Bahnschrift SemiLight" w:hAnsi="Bahnschrift SemiLight"/>
-                <w:sz w:val="28"/>
-                <w:szCs w:val="28"/>
-              </w:rPr>
-            </w:pPr>
-            <w:r>
-              <w:rPr>
-                <w:rFonts w:ascii="Bahnschrift SemiLight" w:hAnsi="Bahnschrift SemiLight"/>
-                <w:sz w:val="28"/>
-                <w:szCs w:val="28"/>
-              </w:rPr>
-              <w:t>Number of additions to GitHub</w:t>
-            </w:r>
-          </w:p>
-        </w:tc>
-        <w:tc>
-          <w:tcPr>
-            <w:tcW w:w="3005" w:type="dxa"/>
-          </w:tcPr>
-          <w:p>
-            <w:pPr>
-              <w:jc w:val="center"/>
-              <w:rPr>
-                <w:rFonts w:ascii="Bahnschrift SemiLight" w:hAnsi="Bahnschrift SemiLight"/>
-                <w:sz w:val="28"/>
-                <w:szCs w:val="28"/>
-              </w:rPr>
-            </w:pPr>
-          </w:p>
-        </w:tc>
-        <w:tc>
-          <w:tcPr>
-            <w:tcW w:w="3006" w:type="dxa"/>
-          </w:tcPr>
-          <w:p>
-            <w:pPr>
-              <w:jc w:val="center"/>
-              <w:rPr>
-                <w:rFonts w:ascii="Bahnschrift SemiLight" w:hAnsi="Bahnschrift SemiLight"/>
-                <w:sz w:val="28"/>
-                <w:szCs w:val="28"/>
-              </w:rPr>
-            </w:pPr>
-          </w:p>
-        </w:tc>
-      </w:tr>
-      <w:tr>
-        <w:tc>
-          <w:tcPr>
-            <w:tcW w:w="3005" w:type="dxa"/>
-          </w:tcPr>
-          <w:p>
-            <w:pPr>
-              <w:jc w:val="center"/>
-              <w:rPr>
-                <w:rFonts w:ascii="Bahnschrift SemiLight" w:hAnsi="Bahnschrift SemiLight"/>
-                <w:sz w:val="28"/>
-                <w:szCs w:val="28"/>
-              </w:rPr>
-            </w:pPr>
-            <w:r>
-              <w:rPr>
-                <w:rFonts w:ascii="Bahnschrift SemiLight" w:hAnsi="Bahnschrift SemiLight"/>
-                <w:sz w:val="28"/>
-                <w:szCs w:val="28"/>
-              </w:rPr>
-              <w:t>Number of Deletions to GitHub</w:t>
-            </w:r>
-          </w:p>
-        </w:tc>
-        <w:tc>
-          <w:tcPr>
-            <w:tcW w:w="3005" w:type="dxa"/>
-          </w:tcPr>
-          <w:p>
-            <w:pPr>
-              <w:jc w:val="center"/>
-              <w:rPr>
-                <w:rFonts w:ascii="Bahnschrift SemiLight" w:hAnsi="Bahnschrift SemiLight"/>
-                <w:sz w:val="28"/>
-                <w:szCs w:val="28"/>
-              </w:rPr>
-            </w:pPr>
-          </w:p>
-        </w:tc>
-        <w:tc>
-          <w:tcPr>
-            <w:tcW w:w="3006" w:type="dxa"/>
-          </w:tcPr>
-          <w:p>
-            <w:pPr>
-              <w:jc w:val="center"/>
-              <w:rPr>
-                <w:rFonts w:ascii="Bahnschrift SemiLight" w:hAnsi="Bahnschrift SemiLight"/>
-                <w:sz w:val="28"/>
-                <w:szCs w:val="28"/>
-              </w:rPr>
-            </w:pPr>
-          </w:p>
-        </w:tc>
-      </w:tr>
-      <w:tr>
-        <w:tc>
-          <w:tcPr>
-            <w:tcW w:w="3005" w:type="dxa"/>
-          </w:tcPr>
-          <w:p>
-            <w:pPr>
-              <w:jc w:val="center"/>
-              <w:rPr>
-                <w:rFonts w:ascii="Bahnschrift SemiLight" w:hAnsi="Bahnschrift SemiLight"/>
-                <w:sz w:val="28"/>
-                <w:szCs w:val="28"/>
-              </w:rPr>
-            </w:pPr>
-            <w:r>
-              <w:rPr>
-                <w:rFonts w:ascii="Bahnschrift SemiLight" w:hAnsi="Bahnschrift SemiLight"/>
-                <w:sz w:val="28"/>
-                <w:szCs w:val="28"/>
-              </w:rPr>
-              <w:t>Data pipeline diagram</w:t>
-            </w:r>
-          </w:p>
-        </w:tc>
-        <w:tc>
-          <w:tcPr>
-            <w:tcW w:w="3005" w:type="dxa"/>
-          </w:tcPr>
-          <w:p>
-            <w:pPr>
-              <w:jc w:val="center"/>
-              <w:rPr>
-                <w:rFonts w:ascii="Bahnschrift SemiLight" w:hAnsi="Bahnschrift SemiLight"/>
-                <w:sz w:val="28"/>
-                <w:szCs w:val="28"/>
-              </w:rPr>
-            </w:pPr>
-          </w:p>
-        </w:tc>
-        <w:tc>
-          <w:tcPr>
-            <w:tcW w:w="3006" w:type="dxa"/>
-          </w:tcPr>
-          <w:p>
-            <w:pPr>
-              <w:jc w:val="center"/>
-              <w:rPr>
-                <w:rFonts w:ascii="Bahnschrift SemiLight" w:hAnsi="Bahnschrift SemiLight"/>
-                <w:sz w:val="28"/>
-                <w:szCs w:val="28"/>
-              </w:rPr>
-            </w:pPr>
-          </w:p>
-        </w:tc>
-      </w:tr>
-      <w:tr>
-        <w:tc>
-          <w:tcPr>
-            <w:tcW w:w="3005" w:type="dxa"/>
-          </w:tcPr>
-          <w:p>
-            <w:pPr>
-              <w:jc w:val="center"/>
-              <w:rPr>
-                <w:rFonts w:ascii="Bahnschrift SemiLight" w:hAnsi="Bahnschrift SemiLight"/>
-                <w:sz w:val="28"/>
-                <w:szCs w:val="28"/>
-              </w:rPr>
-            </w:pPr>
-            <w:r>
-              <w:rPr>
-                <w:rFonts w:ascii="Bahnschrift SemiLight" w:hAnsi="Bahnschrift SemiLight"/>
-                <w:sz w:val="28"/>
-                <w:szCs w:val="28"/>
-              </w:rPr>
-              <w:t>Progress report</w:t>
-            </w:r>
-          </w:p>
-        </w:tc>
-        <w:tc>
-          <w:tcPr>
-            <w:tcW w:w="3005" w:type="dxa"/>
-          </w:tcPr>
-          <w:p>
-            <w:pPr>
-              <w:jc w:val="center"/>
-              <w:rPr>
-                <w:rFonts w:ascii="Bahnschrift SemiLight" w:hAnsi="Bahnschrift SemiLight"/>
-                <w:sz w:val="28"/>
-                <w:szCs w:val="28"/>
-              </w:rPr>
-            </w:pPr>
-          </w:p>
-        </w:tc>
-        <w:tc>
-          <w:tcPr>
-            <w:tcW w:w="3006" w:type="dxa"/>
-          </w:tcPr>
-          <w:p>
-            <w:pPr>
-              <w:jc w:val="center"/>
-              <w:rPr>
-                <w:rFonts w:ascii="Bahnschrift SemiLight" w:hAnsi="Bahnschrift SemiLight"/>
-                <w:sz w:val="28"/>
-                <w:szCs w:val="28"/>
-              </w:rPr>
-            </w:pPr>
-          </w:p>
-        </w:tc>
-      </w:tr>
-      <w:tr>
-        <w:tc>
-          <w:tcPr>
-            <w:tcW w:w="3005" w:type="dxa"/>
-          </w:tcPr>
-          <w:p>
-            <w:pPr>
-              <w:jc w:val="center"/>
-              <w:rPr>
-                <w:rFonts w:ascii="Bahnschrift SemiLight" w:hAnsi="Bahnschrift SemiLight"/>
-                <w:sz w:val="28"/>
-                <w:szCs w:val="28"/>
-              </w:rPr>
-            </w:pPr>
-            <w:r>
-              <w:rPr>
-                <w:rFonts w:ascii="Bahnschrift SemiLight" w:hAnsi="Bahnschrift SemiLight"/>
-                <w:sz w:val="28"/>
-                <w:szCs w:val="28"/>
-              </w:rPr>
-              <w:t>Contribution Statement</w:t>
-            </w:r>
-          </w:p>
-        </w:tc>
-        <w:tc>
-          <w:tcPr>
-            <w:tcW w:w="3005" w:type="dxa"/>
-          </w:tcPr>
-          <w:p>
-            <w:pPr>
-              <w:jc w:val="center"/>
-              <w:rPr>
-                <w:rFonts w:ascii="Bahnschrift SemiLight" w:hAnsi="Bahnschrift SemiLight"/>
-                <w:sz w:val="28"/>
-                <w:szCs w:val="28"/>
-              </w:rPr>
-            </w:pPr>
-          </w:p>
-        </w:tc>
-        <w:tc>
-          <w:tcPr>
-            <w:tcW w:w="3006" w:type="dxa"/>
-          </w:tcPr>
-          <w:p>
-            <w:pPr>
-              <w:jc w:val="center"/>
-              <w:rPr>
-                <w:rFonts w:ascii="Bahnschrift SemiLight" w:hAnsi="Bahnschrift SemiLight"/>
-                <w:sz w:val="28"/>
-                <w:szCs w:val="28"/>
-              </w:rPr>
-            </w:pPr>
-          </w:p>
-        </w:tc>
-      </w:tr>
-      <w:tr>
-        <w:tc>
-          <w:tcPr>
-            <w:tcW w:w="3005" w:type="dxa"/>
-          </w:tcPr>
-          <w:p>
-            <w:pPr>
-              <w:jc w:val="center"/>
-              <w:rPr>
-                <w:rFonts w:ascii="Bahnschrift SemiLight" w:hAnsi="Bahnschrift SemiLight"/>
-                <w:sz w:val="28"/>
-                <w:szCs w:val="28"/>
-              </w:rPr>
-            </w:pPr>
-            <w:r>
-              <w:rPr>
-                <w:rFonts w:ascii="Bahnschrift SemiLight" w:hAnsi="Bahnschrift SemiLight"/>
-                <w:sz w:val="28"/>
-                <w:szCs w:val="28"/>
-              </w:rPr>
-              <w:t>GitHub Repository Link .txt</w:t>
-            </w:r>
-          </w:p>
-        </w:tc>
-        <w:tc>
-          <w:tcPr>
-            <w:tcW w:w="3005" w:type="dxa"/>
-          </w:tcPr>
-          <w:p>
-            <w:pPr>
-              <w:jc w:val="center"/>
-              <w:rPr>
-                <w:rFonts w:ascii="Bahnschrift SemiLight" w:hAnsi="Bahnschrift SemiLight"/>
-                <w:sz w:val="28"/>
-                <w:szCs w:val="28"/>
-              </w:rPr>
-            </w:pPr>
-          </w:p>
-        </w:tc>
-        <w:tc>
-          <w:tcPr>
-            <w:tcW w:w="3006" w:type="dxa"/>
-          </w:tcPr>
-          <w:p>
-            <w:pPr>
-              <w:jc w:val="center"/>
-              <w:rPr>
-                <w:rFonts w:ascii="Bahnschrift SemiLight" w:hAnsi="Bahnschrift SemiLight"/>
-                <w:sz w:val="28"/>
-                <w:szCs w:val="28"/>
-              </w:rPr>
-            </w:pPr>
-          </w:p>
-        </w:tc>
-      </w:tr>
-    </w:tbl>
-    <w:p/>
+    <w:p>
+      <w:pPr>
+        <w:rPr>
+          <w:rFonts w:ascii="Bahnschrift SemiLight" w:hAnsi="Bahnschrift SemiLight"/>
+          <w:sz w:val="28"/>
+          <w:szCs w:val="28"/>
+        </w:rPr>
+      </w:pPr>
+    </w:p>
     <w:p>
       <w:r>
         <w:t>Erin Sandra Christopher Contributions</w:t>
       </w:r>
     </w:p>
     <w:p/>
+    <w:p/>
+    <w:p/>
     <w:p>
       <w:r>
         <w:t>Huyin Song Contributions</w:t>
       </w:r>
     </w:p>
+    <w:p/>
+    <w:p/>
     <w:p/>
     <w:p>
       <w:r>

</xml_diff>